<commit_message>
docs(acpos): close system01 info persistence gaps
</commit_message>
<xml_diff>
--- a/ACPOS_INFO-01_MOTHER_BASIC_DESIGN_TECH_PURPLE_v1.0.docx
+++ b/ACPOS_INFO-01_MOTHER_BASIC_DESIGN_TECH_PURPLE_v1.0.docx
@@ -27619,10 +27619,7 @@
           </w:tcPr>
           <w:p>
             <w:r>
-              <w:rPr>
-                <w:sz w:val="10"/>
-              </w:rPr>
-              <w:t>—</w:t>
+              <w:t>Global Brain / Export Artifact + Export Audit</w:t>
             </w:r>
           </w:p>
         </w:tc>
@@ -27790,10 +27787,7 @@
           </w:tcPr>
           <w:p>
             <w:r>
-              <w:rPr>
-                <w:sz w:val="10"/>
-              </w:rPr>
-              <w:t>—</w:t>
+              <w:t>Global Brain / ACPOSStateProjection + Projection Audit</w:t>
             </w:r>
           </w:p>
         </w:tc>
@@ -27961,10 +27955,7 @@
           </w:tcPr>
           <w:p>
             <w:r>
-              <w:rPr>
-                <w:sz w:val="10"/>
-              </w:rPr>
-              <w:t>—</w:t>
+              <w:t>Global Brain / SemanticIndexResult + Search Audit</w:t>
             </w:r>
           </w:p>
         </w:tc>
@@ -38085,9 +38076,322 @@
         <w:t>The exact control denominator above is the only construction denominator for this page. Components/fields/visual IDs are not counted as additional controls. Existing source UIDs are preserved. A control classified UI_LOCAL_EXACT MUST NOT create a server write. A control classified SPEC_EXACT_RUNTIME_BLOCKED / NOT_EXECUTED MUST remain disabled or fail-closed until its runtime evidence exists.</w:t>
       </w:r>
     </w:p>
+    <w:p>
+      <w:pPr>
+        <w:sectPr>
+          <w:pgSz w:w="15840" w:h="12240" w:orient="landscape"/>
+          <w:pgMar w:top="576" w:right="504" w:bottom="576" w:left="504" w:header="720" w:footer="720" w:gutter="0"/>
+          <w:cols w:space="720"/>
+          <w:docGrid w:linePitch="360"/>
+        </w:sectPr>
+      </w:pPr>
+    </w:p>
+    <w:p>
+      <w:pPr>
+        <w:pStyle w:val="Heading1"/>
+      </w:pPr>
+      <w:r>
+        <w:t>Batch 41 · INFO-01 Projection Persistence Binding Ledger</w:t>
+      </w:r>
+    </w:p>
+    <w:p>
+      <w:r>
+        <w:rPr>
+          <w:b/>
+        </w:rPr>
+        <w:t xml:space="preserve">[ACPOS-20260922-BATCH-41-SYSTEM01-INFO-PERSISTENCE-REMEDIATION-V1::PAGE::INFO-01] </w:t>
+      </w:r>
+      <w:r>
+        <w:t>Projection/search/export persistence is derived/audit state only. Domain canonical business rows remain under their original owners. No physical table names are invented and no exported/search result is promoted to canonical truth.</w:t>
+      </w:r>
+    </w:p>
+    <w:tbl>
+      <w:tblPr>
+        <w:tblStyle w:val="TableGrid"/>
+        <w:tblW w:type="auto" w:w="0"/>
+        <w:tblLook w:firstColumn="1" w:firstRow="1" w:lastColumn="0" w:lastRow="0" w:noHBand="0" w:noVBand="1" w:val="04A0"/>
+      </w:tblPr>
+      <w:tblGrid>
+        <w:gridCol w:w="2858"/>
+        <w:gridCol w:w="2858"/>
+        <w:gridCol w:w="2858"/>
+        <w:gridCol w:w="2858"/>
+      </w:tblGrid>
+      <w:tr>
+        <w:trPr>
+          <w:tblHeader w:val="true"/>
+        </w:trPr>
+        <w:tc>
+          <w:tcPr>
+            <w:tcW w:type="dxa" w:w="2858"/>
+            <w:shd w:fill="EDE9FE"/>
+          </w:tcPr>
+          <w:p>
+            <w:pPr>
+              <w:spacing w:before="0" w:after="0"/>
+            </w:pPr>
+            <w:r>
+              <w:rPr>
+                <w:sz w:val="7"/>
+              </w:rPr>
+              <w:t>Control UID</w:t>
+            </w:r>
+          </w:p>
+        </w:tc>
+        <w:tc>
+          <w:tcPr>
+            <w:tcW w:type="dxa" w:w="2858"/>
+            <w:shd w:fill="EDE9FE"/>
+          </w:tcPr>
+          <w:p>
+            <w:pPr>
+              <w:spacing w:before="0" w:after="0"/>
+            </w:pPr>
+            <w:r>
+              <w:rPr>
+                <w:sz w:val="7"/>
+              </w:rPr>
+              <w:t>Operation</w:t>
+            </w:r>
+          </w:p>
+        </w:tc>
+        <w:tc>
+          <w:tcPr>
+            <w:tcW w:type="dxa" w:w="2858"/>
+            <w:shd w:fill="EDE9FE"/>
+          </w:tcPr>
+          <w:p>
+            <w:pPr>
+              <w:spacing w:before="0" w:after="0"/>
+            </w:pPr>
+            <w:r>
+              <w:rPr>
+                <w:sz w:val="7"/>
+              </w:rPr>
+              <w:t>Persistence Owner</w:t>
+            </w:r>
+          </w:p>
+        </w:tc>
+        <w:tc>
+          <w:tcPr>
+            <w:tcW w:type="dxa" w:w="2858"/>
+            <w:shd w:fill="EDE9FE"/>
+          </w:tcPr>
+          <w:p>
+            <w:pPr>
+              <w:spacing w:before="0" w:after="0"/>
+            </w:pPr>
+            <w:r>
+              <w:rPr>
+                <w:sz w:val="7"/>
+              </w:rPr>
+              <w:t>Required Semantics</w:t>
+            </w:r>
+          </w:p>
+        </w:tc>
+      </w:tr>
+      <w:tr>
+        <w:tc>
+          <w:tcPr>
+            <w:tcW w:type="dxa" w:w="2858"/>
+          </w:tcPr>
+          <w:p>
+            <w:pPr>
+              <w:spacing w:before="0" w:after="0"/>
+            </w:pPr>
+            <w:r>
+              <w:rPr>
+                <w:sz w:val="7"/>
+              </w:rPr>
+              <w:t>INFO-01-BTN-REFRESH</w:t>
+            </w:r>
+          </w:p>
+        </w:tc>
+        <w:tc>
+          <w:tcPr>
+            <w:tcW w:type="dxa" w:w="2858"/>
+          </w:tcPr>
+          <w:p>
+            <w:pPr>
+              <w:spacing w:before="0" w:after="0"/>
+            </w:pPr>
+            <w:r>
+              <w:rPr>
+                <w:sz w:val="7"/>
+              </w:rPr>
+              <w:t>refreshProjection</w:t>
+            </w:r>
+          </w:p>
+        </w:tc>
+        <w:tc>
+          <w:tcPr>
+            <w:tcW w:type="dxa" w:w="2858"/>
+          </w:tcPr>
+          <w:p>
+            <w:pPr>
+              <w:spacing w:before="0" w:after="0"/>
+            </w:pPr>
+            <w:r>
+              <w:rPr>
+                <w:sz w:val="7"/>
+              </w:rPr>
+              <w:t>Global Brain / ACPOSStateProjection + Projection Audit</w:t>
+            </w:r>
+          </w:p>
+        </w:tc>
+        <w:tc>
+          <w:tcPr>
+            <w:tcW w:type="dxa" w:w="2858"/>
+          </w:tcPr>
+          <w:p>
+            <w:pPr>
+              <w:spacing w:before="0" w:after="0"/>
+            </w:pPr>
+            <w:r>
+              <w:rPr>
+                <w:sz w:val="7"/>
+              </w:rPr>
+              <w:t>Refresh rematerializes a derived projection for an exact domain version. It must not create a second canonical domain row; projection state/version and audit lineage remain reconstructable.</w:t>
+            </w:r>
+          </w:p>
+        </w:tc>
+      </w:tr>
+      <w:tr>
+        <w:tc>
+          <w:tcPr>
+            <w:tcW w:type="dxa" w:w="2858"/>
+          </w:tcPr>
+          <w:p>
+            <w:pPr>
+              <w:spacing w:before="0" w:after="0"/>
+            </w:pPr>
+            <w:r>
+              <w:rPr>
+                <w:sz w:val="7"/>
+              </w:rPr>
+              <w:t>INFO-01-BTN-SEARCH</w:t>
+            </w:r>
+          </w:p>
+        </w:tc>
+        <w:tc>
+          <w:tcPr>
+            <w:tcW w:type="dxa" w:w="2858"/>
+          </w:tcPr>
+          <w:p>
+            <w:pPr>
+              <w:spacing w:before="0" w:after="0"/>
+            </w:pPr>
+            <w:r>
+              <w:rPr>
+                <w:sz w:val="7"/>
+              </w:rPr>
+              <w:t>searchProjection</w:t>
+            </w:r>
+          </w:p>
+        </w:tc>
+        <w:tc>
+          <w:tcPr>
+            <w:tcW w:type="dxa" w:w="2858"/>
+          </w:tcPr>
+          <w:p>
+            <w:pPr>
+              <w:spacing w:before="0" w:after="0"/>
+            </w:pPr>
+            <w:r>
+              <w:rPr>
+                <w:sz w:val="7"/>
+              </w:rPr>
+              <w:t>Global Brain / SemanticIndexResult + Search Audit</w:t>
+            </w:r>
+          </w:p>
+        </w:tc>
+        <w:tc>
+          <w:tcPr>
+            <w:tcW w:type="dxa" w:w="2858"/>
+          </w:tcPr>
+          <w:p>
+            <w:pPr>
+              <w:spacing w:before="0" w:after="0"/>
+            </w:pPr>
+            <w:r>
+              <w:rPr>
+                <w:sz w:val="7"/>
+              </w:rPr>
+              <w:t>Search persists only search/index result pointers, scope and audit/evidence needed to dereference exact source/version/evidence. Search score/result is not canonical truth.</w:t>
+            </w:r>
+          </w:p>
+        </w:tc>
+      </w:tr>
+      <w:tr>
+        <w:tc>
+          <w:tcPr>
+            <w:tcW w:type="dxa" w:w="2858"/>
+          </w:tcPr>
+          <w:p>
+            <w:pPr>
+              <w:spacing w:before="0" w:after="0"/>
+            </w:pPr>
+            <w:r>
+              <w:rPr>
+                <w:sz w:val="7"/>
+              </w:rPr>
+              <w:t>INFO-01-BTN-EXPORT</w:t>
+            </w:r>
+          </w:p>
+        </w:tc>
+        <w:tc>
+          <w:tcPr>
+            <w:tcW w:type="dxa" w:w="2858"/>
+          </w:tcPr>
+          <w:p>
+            <w:pPr>
+              <w:spacing w:before="0" w:after="0"/>
+            </w:pPr>
+            <w:r>
+              <w:rPr>
+                <w:sz w:val="7"/>
+              </w:rPr>
+              <w:t>exportProjection</w:t>
+            </w:r>
+          </w:p>
+        </w:tc>
+        <w:tc>
+          <w:tcPr>
+            <w:tcW w:type="dxa" w:w="2858"/>
+          </w:tcPr>
+          <w:p>
+            <w:pPr>
+              <w:spacing w:before="0" w:after="0"/>
+            </w:pPr>
+            <w:r>
+              <w:rPr>
+                <w:sz w:val="7"/>
+              </w:rPr>
+              <w:t>Global Brain / Export Artifact + Export Audit</w:t>
+            </w:r>
+          </w:p>
+        </w:tc>
+        <w:tc>
+          <w:tcPr>
+            <w:tcW w:type="dxa" w:w="2858"/>
+          </w:tcPr>
+          <w:p>
+            <w:pPr>
+              <w:spacing w:before="0" w:after="0"/>
+            </w:pPr>
+            <w:r>
+              <w:rPr>
+                <w:sz w:val="7"/>
+              </w:rPr>
+              <w:t>Export persists an authorized derived export artifact and audit lineage for the exact projection/scope. Export output does not become a second canonical owner for domain data.</w:t>
+            </w:r>
+          </w:p>
+        </w:tc>
+      </w:tr>
+    </w:tbl>
     <w:sectPr>
-      <w:pgSz w:w="15840" w:h="12240" w:orient="landscape"/>
-      <w:pgMar w:top="576" w:right="504" w:bottom="576" w:left="504" w:header="720" w:footer="720" w:gutter="0"/>
+      <w:pgSz w:w="12240" w:h="15840" w:orient="landscape"/>
+      <w:pgMar w:top="475" w:right="403" w:bottom="475" w:left="403" w:header="720" w:footer="720" w:gutter="0"/>
       <w:cols w:space="720"/>
       <w:docGrid w:linePitch="360"/>
     </w:sectPr>

</xml_diff>